<commit_message>
Bổ sung thêm file UI_Factory, UI_Layouts, Sửa ). Docs all
</commit_message>
<xml_diff>
--- a/0_Documentation/0. Docs all.docx
+++ b/0_Documentation/0. Docs all.docx
@@ -9283,7 +9283,31 @@
         <w:t>Cập nhật ngầm (Background Sync/Chunking):</w:t>
       </w:r>
       <w:r>
-        <w:t xml:space="preserve"> Diễn ra liên tục ngay sau khi khởi tạo. Hệ thống âm thầm tải dữ liệu giao dịch (Act) theo từng gói nhỏ để lấp đầy bộ nhớ RAM mà không làm gián đoạn thao tác của người dùng. </w:t>
+        <w:t xml:space="preserve"> </w:t>
+      </w:r>
+      <w:r>
+        <w:t>Diễn ra liên tục ngay sau khi khởi tạo. Hệ thống âm thầm tải dữ liệu giao dịch (Act) theo từng gói nhỏ để lấp đầy bộ nhớ RAM mà không làm gián đoạn thao tác của người dùng (load ngư</w:t>
+      </w:r>
+      <w:r>
+        <w:rPr>
+          <w:lang w:val="vi-VN"/>
+        </w:rPr>
+        <w:t>ợ</w:t>
+      </w:r>
+      <w:r>
+        <w:t>c từ dòng cuối cùng lên dòng đầu tiên, do các khách hàng mới, giao dịch mới thư</w:t>
+      </w:r>
+      <w:r>
+        <w:rPr>
+          <w:lang w:val="vi-VN"/>
+        </w:rPr>
+        <w:t>ờ</w:t>
+      </w:r>
+      <w:r>
+        <w:t>ng nằm ở cuối cùng)</w:t>
+      </w:r>
+      <w:r>
+        <w:t xml:space="preserve">. </w:t>
       </w:r>
     </w:p>
     <w:p>

</xml_diff>